<commit_message>
Add title page from Title.docx to all lab reports with correct lab numbers
</commit_message>
<xml_diff>
--- a/ЛР1/Lab1_Report.docx
+++ b/ЛР1/Lab1_Report.docx
@@ -2,6 +2,481 @@
 <file path=word/document.xml><?xml version="1.0" encoding="utf-8"?>
 <w:document xmlns:wpc="http://schemas.microsoft.com/office/word/2010/wordprocessingCanvas" xmlns:mo="http://schemas.microsoft.com/office/mac/office/2008/main" xmlns:mc="http://schemas.openxmlformats.org/markup-compatibility/2006" xmlns:mv="urn:schemas-microsoft-com:mac:vml" xmlns:o="urn:schemas-microsoft-com:office:office" xmlns:r="http://schemas.openxmlformats.org/officeDocument/2006/relationships" xmlns:m="http://schemas.openxmlformats.org/officeDocument/2006/math" xmlns:v="urn:schemas-microsoft-com:vml" xmlns:wp14="http://schemas.microsoft.com/office/word/2010/wordprocessingDrawing" xmlns:wp="http://schemas.openxmlformats.org/drawingml/2006/wordprocessingDrawing" xmlns:w10="urn:schemas-microsoft-com:office:word" xmlns:w="http://schemas.openxmlformats.org/wordprocessingml/2006/main" xmlns:w14="http://schemas.microsoft.com/office/word/2010/wordml" xmlns:wpg="http://schemas.microsoft.com/office/word/2010/wordprocessingGroup" xmlns:wpi="http://schemas.microsoft.com/office/word/2010/wordprocessingInk" xmlns:wne="http://schemas.microsoft.com/office/word/2006/wordml" xmlns:wps="http://schemas.microsoft.com/office/word/2010/wordprocessingShape" mc:Ignorable="w14 wp14">
   <w:body>
+    <w:p>
+      <w:pPr>
+        <w:spacing w:line="360" w:lineRule="auto"/>
+        <w:jc w:val="center"/>
+        <w:rPr>
+          <w:rFonts w:ascii="Times New Roman" w:eastAsia="Times New Roman" w:hAnsi="Times New Roman" w:cs="Times New Roman"/>
+          <w:sz w:val="28"/>
+          <w:szCs w:val="28"/>
+        </w:rPr>
+      </w:pPr>
+      <w:r>
+        <w:rPr>
+          <w:rFonts w:ascii="Times New Roman" w:eastAsia="Times New Roman" w:hAnsi="Times New Roman" w:cs="Times New Roman"/>
+          <w:sz w:val="28"/>
+          <w:szCs w:val="28"/>
+        </w:rPr>
+        <w:t>Міністерство освіти і науки України</w:t>
+      </w:r>
+    </w:p>
+    <w:p>
+      <w:pPr>
+        <w:spacing w:line="360" w:lineRule="auto"/>
+        <w:jc w:val="center"/>
+        <w:rPr>
+          <w:rFonts w:ascii="Times New Roman" w:eastAsia="Times New Roman" w:hAnsi="Times New Roman" w:cs="Times New Roman"/>
+          <w:sz w:val="28"/>
+          <w:szCs w:val="28"/>
+        </w:rPr>
+      </w:pPr>
+      <w:r>
+        <w:rPr>
+          <w:rFonts w:ascii="Times New Roman" w:eastAsia="Times New Roman" w:hAnsi="Times New Roman" w:cs="Times New Roman"/>
+          <w:sz w:val="28"/>
+          <w:szCs w:val="28"/>
+        </w:rPr>
+        <w:t>Національний технічний університет</w:t>
+      </w:r>
+    </w:p>
+    <w:p>
+      <w:pPr>
+        <w:spacing w:line="360" w:lineRule="auto"/>
+        <w:jc w:val="center"/>
+        <w:rPr>
+          <w:rFonts w:ascii="Times New Roman" w:eastAsia="Times New Roman" w:hAnsi="Times New Roman" w:cs="Times New Roman"/>
+          <w:sz w:val="28"/>
+          <w:szCs w:val="28"/>
+        </w:rPr>
+      </w:pPr>
+      <w:r>
+        <w:rPr>
+          <w:rFonts w:ascii="Times New Roman" w:eastAsia="Times New Roman" w:hAnsi="Times New Roman" w:cs="Times New Roman"/>
+          <w:sz w:val="28"/>
+          <w:szCs w:val="28"/>
+        </w:rPr>
+        <w:t>«Харківський політехнічний інститут»</w:t>
+      </w:r>
+    </w:p>
+    <w:p>
+      <w:pPr>
+        <w:spacing w:line="360" w:lineRule="auto"/>
+        <w:jc w:val="center"/>
+        <w:rPr>
+          <w:rFonts w:ascii="Times New Roman" w:eastAsia="Times New Roman" w:hAnsi="Times New Roman" w:cs="Times New Roman"/>
+          <w:sz w:val="28"/>
+          <w:szCs w:val="28"/>
+        </w:rPr>
+      </w:pPr>
+      <w:r>
+        <w:rPr>
+          <w:rFonts w:ascii="Times New Roman" w:eastAsia="Times New Roman" w:hAnsi="Times New Roman" w:cs="Times New Roman"/>
+          <w:sz w:val="28"/>
+          <w:szCs w:val="28"/>
+        </w:rPr>
+        <w:t xml:space="preserve">Навчально-науковий інститут комп'ютерних наук та інформаційних технологій </w:t>
+      </w:r>
+    </w:p>
+    <w:p>
+      <w:pPr>
+        <w:spacing w:line="360" w:lineRule="auto"/>
+        <w:jc w:val="center"/>
+        <w:rPr>
+          <w:rFonts w:ascii="Times New Roman" w:eastAsia="Times New Roman" w:hAnsi="Times New Roman" w:cs="Times New Roman"/>
+          <w:sz w:val="28"/>
+          <w:szCs w:val="28"/>
+        </w:rPr>
+      </w:pPr>
+      <w:r>
+        <w:rPr>
+          <w:rFonts w:ascii="Times New Roman" w:eastAsia="Times New Roman" w:hAnsi="Times New Roman" w:cs="Times New Roman"/>
+          <w:sz w:val="28"/>
+          <w:szCs w:val="28"/>
+        </w:rPr>
+        <w:t xml:space="preserve">Кафедра системного аналізу та інформаційно-аналітичних технологій </w:t>
+      </w:r>
+    </w:p>
+    <w:p>
+      <w:pPr>
+        <w:spacing w:line="360" w:lineRule="auto"/>
+        <w:jc w:val="center"/>
+        <w:rPr>
+          <w:rFonts w:ascii="Times New Roman" w:eastAsia="Times New Roman" w:hAnsi="Times New Roman" w:cs="Times New Roman"/>
+          <w:sz w:val="28"/>
+          <w:szCs w:val="28"/>
+        </w:rPr>
+      </w:pPr>
+      <w:r>
+        <w:rPr>
+          <w:rFonts w:ascii="Times New Roman" w:eastAsia="Times New Roman" w:hAnsi="Times New Roman" w:cs="Times New Roman"/>
+          <w:sz w:val="28"/>
+          <w:szCs w:val="28"/>
+        </w:rPr>
+        <w:t xml:space="preserve"> (САІТ)</w:t>
+      </w:r>
+    </w:p>
+    <w:p>
+      <w:pPr>
+        <w:spacing w:line="360" w:lineRule="auto"/>
+        <w:jc w:val="both"/>
+        <w:rPr>
+          <w:rFonts w:ascii="Times New Roman" w:eastAsia="Times New Roman" w:hAnsi="Times New Roman" w:cs="Times New Roman"/>
+          <w:sz w:val="28"/>
+          <w:szCs w:val="28"/>
+        </w:rPr>
+      </w:pPr>
+    </w:p>
+    <w:p>
+      <w:pPr>
+        <w:spacing w:line="360" w:lineRule="auto"/>
+        <w:jc w:val="both"/>
+        <w:rPr>
+          <w:rFonts w:ascii="Times New Roman" w:eastAsia="Times New Roman" w:hAnsi="Times New Roman" w:cs="Times New Roman"/>
+          <w:sz w:val="28"/>
+          <w:szCs w:val="28"/>
+        </w:rPr>
+      </w:pPr>
+    </w:p>
+    <w:p>
+      <w:pPr>
+        <w:spacing w:line="360" w:lineRule="auto"/>
+        <w:jc w:val="both"/>
+        <w:rPr>
+          <w:rFonts w:ascii="Times New Roman" w:eastAsia="Times New Roman" w:hAnsi="Times New Roman" w:cs="Times New Roman"/>
+          <w:sz w:val="28"/>
+          <w:szCs w:val="28"/>
+        </w:rPr>
+      </w:pPr>
+    </w:p>
+    <w:p>
+      <w:pPr>
+        <w:spacing w:line="360" w:lineRule="auto"/>
+        <w:jc w:val="center"/>
+        <w:rPr>
+          <w:rFonts w:ascii="Times New Roman" w:eastAsia="Times New Roman" w:hAnsi="Times New Roman" w:cs="Times New Roman"/>
+          <w:sz w:val="28"/>
+          <w:szCs w:val="28"/>
+        </w:rPr>
+      </w:pPr>
+      <w:r>
+        <w:rPr>
+          <w:rFonts w:ascii="Times New Roman" w:eastAsia="Times New Roman" w:hAnsi="Times New Roman" w:cs="Times New Roman"/>
+          <w:smallCaps/>
+          <w:sz w:val="28"/>
+          <w:szCs w:val="28"/>
+        </w:rPr>
+        <w:t>ЗВІТ</w:t>
+      </w:r>
+    </w:p>
+    <w:p>
+      <w:pPr>
+        <w:spacing w:line="360" w:lineRule="auto"/>
+        <w:jc w:val="center"/>
+        <w:rPr>
+          <w:rFonts w:ascii="Times New Roman" w:eastAsia="Times New Roman" w:hAnsi="Times New Roman" w:cs="Times New Roman"/>
+          <w:sz w:val="28"/>
+          <w:szCs w:val="28"/>
+        </w:rPr>
+      </w:pPr>
+    </w:p>
+    <w:p>
+      <w:pPr>
+        <w:spacing w:line="360" w:lineRule="auto"/>
+        <w:jc w:val="center"/>
+        <w:rPr>
+          <w:rFonts w:ascii="Times New Roman" w:eastAsia="Times New Roman" w:hAnsi="Times New Roman" w:cs="Times New Roman"/>
+          <w:sz w:val="28"/>
+          <w:szCs w:val="28"/>
+        </w:rPr>
+      </w:pPr>
+      <w:r>
+        <w:rPr>
+          <w:rFonts w:ascii="Times New Roman" w:eastAsia="Times New Roman" w:hAnsi="Times New Roman" w:cs="Times New Roman"/>
+          <w:sz w:val="28"/>
+          <w:szCs w:val="28"/>
+        </w:rPr>
+        <w:t>про виконання лабораторної роботи №1</w:t>
+      </w:r>
+    </w:p>
+    <w:p>
+      <w:pPr>
+        <w:spacing w:line="360" w:lineRule="auto"/>
+        <w:jc w:val="center"/>
+        <w:rPr>
+          <w:rFonts w:ascii="Times New Roman" w:eastAsia="Times New Roman" w:hAnsi="Times New Roman" w:cs="Times New Roman"/>
+          <w:sz w:val="28"/>
+          <w:szCs w:val="28"/>
+        </w:rPr>
+      </w:pPr>
+    </w:p>
+    <w:p>
+      <w:pPr>
+        <w:spacing w:line="360" w:lineRule="auto"/>
+        <w:jc w:val="center"/>
+        <w:rPr>
+          <w:rFonts w:ascii="Times New Roman" w:eastAsia="Times New Roman" w:hAnsi="Times New Roman" w:cs="Times New Roman"/>
+          <w:sz w:val="28"/>
+          <w:szCs w:val="28"/>
+        </w:rPr>
+      </w:pPr>
+      <w:r>
+        <w:rPr>
+          <w:rFonts w:ascii="Times New Roman" w:eastAsia="Times New Roman" w:hAnsi="Times New Roman" w:cs="Times New Roman"/>
+          <w:sz w:val="28"/>
+          <w:szCs w:val="28"/>
+        </w:rPr>
+        <w:t>за дисципліною</w:t>
+      </w:r>
+    </w:p>
+    <w:p>
+      <w:pPr>
+        <w:spacing w:line="360" w:lineRule="auto"/>
+        <w:jc w:val="center"/>
+        <w:rPr>
+          <w:rFonts w:ascii="Times New Roman" w:eastAsia="Times New Roman" w:hAnsi="Times New Roman" w:cs="Times New Roman"/>
+          <w:sz w:val="28"/>
+          <w:szCs w:val="28"/>
+        </w:rPr>
+      </w:pPr>
+      <w:r>
+        <w:rPr>
+          <w:rFonts w:ascii="Times New Roman" w:eastAsia="Times New Roman" w:hAnsi="Times New Roman" w:cs="Times New Roman"/>
+          <w:sz w:val="28"/>
+          <w:szCs w:val="28"/>
+        </w:rPr>
+        <w:t>«Штучні нейронні мережі»</w:t>
+      </w:r>
+    </w:p>
+    <w:p>
+      <w:pPr>
+        <w:spacing w:line="360" w:lineRule="auto"/>
+        <w:jc w:val="both"/>
+        <w:rPr>
+          <w:rFonts w:ascii="Times New Roman" w:eastAsia="Times New Roman" w:hAnsi="Times New Roman" w:cs="Times New Roman"/>
+          <w:sz w:val="28"/>
+          <w:szCs w:val="28"/>
+        </w:rPr>
+      </w:pPr>
+    </w:p>
+    <w:p>
+      <w:pPr>
+        <w:spacing w:line="360" w:lineRule="auto"/>
+        <w:jc w:val="both"/>
+        <w:rPr>
+          <w:rFonts w:ascii="Times New Roman" w:eastAsia="Times New Roman" w:hAnsi="Times New Roman" w:cs="Times New Roman"/>
+          <w:sz w:val="28"/>
+          <w:szCs w:val="28"/>
+        </w:rPr>
+      </w:pPr>
+    </w:p>
+    <w:p>
+      <w:pPr>
+        <w:spacing w:line="360" w:lineRule="auto"/>
+        <w:jc w:val="both"/>
+        <w:rPr>
+          <w:rFonts w:ascii="Times New Roman" w:eastAsia="Times New Roman" w:hAnsi="Times New Roman" w:cs="Times New Roman"/>
+          <w:sz w:val="28"/>
+          <w:szCs w:val="28"/>
+        </w:rPr>
+      </w:pPr>
+    </w:p>
+    <w:p>
+      <w:pPr>
+        <w:spacing w:line="360" w:lineRule="auto"/>
+        <w:jc w:val="both"/>
+        <w:rPr>
+          <w:rFonts w:ascii="Times New Roman" w:eastAsia="Times New Roman" w:hAnsi="Times New Roman" w:cs="Times New Roman"/>
+          <w:sz w:val="28"/>
+          <w:szCs w:val="28"/>
+        </w:rPr>
+      </w:pPr>
+      <w:r>
+        <w:rPr>
+          <w:rFonts w:ascii="Times New Roman" w:eastAsia="Times New Roman" w:hAnsi="Times New Roman" w:cs="Times New Roman"/>
+          <w:sz w:val="28"/>
+          <w:szCs w:val="28"/>
+        </w:rPr>
+        <w:t>Виконав</w:t>
+      </w:r>
+    </w:p>
+    <w:p>
+      <w:pPr>
+        <w:tabs>
+          <w:tab w:val="right" w:pos="9356"/>
+        </w:tabs>
+        <w:spacing w:line="360" w:lineRule="auto"/>
+        <w:jc w:val="both"/>
+        <w:rPr>
+          <w:rFonts w:ascii="Times New Roman" w:eastAsia="Times New Roman" w:hAnsi="Times New Roman" w:cs="Times New Roman"/>
+          <w:sz w:val="28"/>
+          <w:szCs w:val="28"/>
+          <w:lang w:val="ru-RU"/>
+        </w:rPr>
+      </w:pPr>
+      <w:r>
+        <w:rPr>
+          <w:rFonts w:ascii="Times New Roman" w:eastAsia="Times New Roman" w:hAnsi="Times New Roman" w:cs="Times New Roman"/>
+          <w:sz w:val="28"/>
+          <w:szCs w:val="28"/>
+        </w:rPr>
+        <w:t>студентка групи КН-1224с</w:t>
+      </w:r>
+      <w:r>
+        <w:rPr>
+          <w:rFonts w:ascii="Times New Roman" w:eastAsia="Times New Roman" w:hAnsi="Times New Roman" w:cs="Times New Roman"/>
+          <w:sz w:val="28"/>
+          <w:szCs w:val="28"/>
+        </w:rPr>
+        <w:tab/>
+      </w:r>
+      <w:r>
+        <w:rPr>
+          <w:rFonts w:ascii="Times New Roman" w:eastAsia="Times New Roman" w:hAnsi="Times New Roman" w:cs="Times New Roman"/>
+          <w:sz w:val="28"/>
+          <w:szCs w:val="28"/>
+          <w:lang w:val="ru-RU"/>
+        </w:rPr>
+        <w:t>Мульков Максим</w:t>
+      </w:r>
+    </w:p>
+    <w:p>
+      <w:pPr>
+        <w:spacing w:line="360" w:lineRule="auto"/>
+        <w:jc w:val="both"/>
+        <w:rPr>
+          <w:rFonts w:ascii="Times New Roman" w:eastAsia="Times New Roman" w:hAnsi="Times New Roman" w:cs="Times New Roman"/>
+          <w:sz w:val="28"/>
+          <w:szCs w:val="28"/>
+        </w:rPr>
+      </w:pPr>
+    </w:p>
+    <w:p>
+      <w:pPr>
+        <w:spacing w:line="360" w:lineRule="auto"/>
+        <w:jc w:val="both"/>
+        <w:rPr>
+          <w:rFonts w:ascii="Times New Roman" w:eastAsia="Times New Roman" w:hAnsi="Times New Roman" w:cs="Times New Roman"/>
+          <w:sz w:val="28"/>
+          <w:szCs w:val="28"/>
+        </w:rPr>
+      </w:pPr>
+    </w:p>
+    <w:p>
+      <w:pPr>
+        <w:spacing w:line="360" w:lineRule="auto"/>
+        <w:jc w:val="both"/>
+        <w:rPr>
+          <w:rFonts w:ascii="Times New Roman" w:eastAsia="Times New Roman" w:hAnsi="Times New Roman" w:cs="Times New Roman"/>
+          <w:sz w:val="28"/>
+          <w:szCs w:val="28"/>
+        </w:rPr>
+      </w:pPr>
+    </w:p>
+    <w:p>
+      <w:pPr>
+        <w:spacing w:line="360" w:lineRule="auto"/>
+        <w:jc w:val="both"/>
+        <w:rPr>
+          <w:rFonts w:ascii="Times New Roman" w:eastAsia="Times New Roman" w:hAnsi="Times New Roman" w:cs="Times New Roman"/>
+          <w:sz w:val="28"/>
+          <w:szCs w:val="28"/>
+        </w:rPr>
+      </w:pPr>
+      <w:r>
+        <w:rPr>
+          <w:rFonts w:ascii="Times New Roman" w:eastAsia="Times New Roman" w:hAnsi="Times New Roman" w:cs="Times New Roman"/>
+          <w:sz w:val="28"/>
+          <w:szCs w:val="28"/>
+        </w:rPr>
+        <w:t>Перевірив</w:t>
+      </w:r>
+    </w:p>
+    <w:p>
+      <w:pPr>
+        <w:tabs>
+          <w:tab w:val="right" w:pos="9356"/>
+        </w:tabs>
+        <w:spacing w:line="360" w:lineRule="auto"/>
+        <w:jc w:val="both"/>
+        <w:rPr>
+          <w:rFonts w:ascii="Times New Roman" w:eastAsia="Times New Roman" w:hAnsi="Times New Roman" w:cs="Times New Roman"/>
+          <w:sz w:val="28"/>
+          <w:szCs w:val="28"/>
+        </w:rPr>
+      </w:pPr>
+      <w:r>
+        <w:rPr>
+          <w:rFonts w:ascii="Times New Roman" w:eastAsia="Times New Roman" w:hAnsi="Times New Roman" w:cs="Times New Roman"/>
+          <w:sz w:val="28"/>
+          <w:szCs w:val="28"/>
+        </w:rPr>
+        <w:t>професор кафедри САІТ</w:t>
+      </w:r>
+      <w:r>
+        <w:rPr>
+          <w:rFonts w:ascii="Times New Roman" w:eastAsia="Times New Roman" w:hAnsi="Times New Roman" w:cs="Times New Roman"/>
+          <w:sz w:val="28"/>
+          <w:szCs w:val="28"/>
+        </w:rPr>
+        <w:tab/>
+        <w:t>Юрій Паржин</w:t>
+      </w:r>
+    </w:p>
+    <w:p>
+      <w:pPr>
+        <w:spacing w:line="360" w:lineRule="auto"/>
+        <w:jc w:val="both"/>
+        <w:rPr>
+          <w:rFonts w:ascii="Times New Roman" w:eastAsia="Times New Roman" w:hAnsi="Times New Roman" w:cs="Times New Roman"/>
+          <w:sz w:val="28"/>
+          <w:szCs w:val="28"/>
+        </w:rPr>
+      </w:pPr>
+    </w:p>
+    <w:p>
+      <w:pPr>
+        <w:spacing w:line="360" w:lineRule="auto"/>
+        <w:jc w:val="both"/>
+        <w:rPr>
+          <w:rFonts w:ascii="Times New Roman" w:eastAsia="Times New Roman" w:hAnsi="Times New Roman" w:cs="Times New Roman"/>
+          <w:sz w:val="28"/>
+          <w:szCs w:val="28"/>
+        </w:rPr>
+      </w:pPr>
+    </w:p>
+    <w:p>
+      <w:pPr>
+        <w:spacing w:line="360" w:lineRule="auto"/>
+        <w:jc w:val="center"/>
+        <w:rPr>
+          <w:rFonts w:ascii="Times New Roman" w:eastAsia="Times New Roman" w:hAnsi="Times New Roman" w:cs="Times New Roman"/>
+        </w:rPr>
+      </w:pPr>
+      <w:r>
+        <w:rPr>
+          <w:rFonts w:ascii="Times New Roman" w:eastAsia="Times New Roman" w:hAnsi="Times New Roman" w:cs="Times New Roman"/>
+          <w:sz w:val="28"/>
+          <w:szCs w:val="28"/>
+        </w:rPr>
+        <w:t>Харків 2026</w:t>
+      </w:r>
+      <w:bookmarkStart w:id="0" w:name="_rqueo36c9qo4" w:colFirst="0" w:colLast="0"/>
+      <w:bookmarkStart w:id="1" w:name="_GoBack"/>
+      <w:bookmarkEnd w:id="0"/>
+      <w:bookmarkEnd w:id="1"/>
+    </w:p>
+    <w:sectPr>
+      <w:pgSz w:w="11909" w:h="16834"/>
+      <w:pgMar w:top="1440" w:right="1440" w:bottom="1440" w:left="1440" w:header="720" w:footer="720" w:gutter="0"/>
+      <w:pgNumType w:start="1"/>
+      <w:cols w:space="720"/>
+    </w:sectPr>
+    <w:p>
+      <w:r>
+        <w:br w:type="page"/>
+      </w:r>
+    </w:p>
     <w:p>
       <w:pPr>
         <w:spacing w:before="240" w:after="120"/>

</xml_diff>